<commit_message>
Update itinerary with Schwerin stop and train transfer
</commit_message>
<xml_diff>
--- a/output/family_trip_berlin_eberswalde_luebeck_hamburg_links.docx
+++ b/output/family_trip_berlin_eberswalde_luebeck_hamburg_links.docx
@@ -474,10 +474,7 @@
         <w:jc w:val="right"/>
       </w:pPr>
       <w:r>
-        <w:rPr>
-          <w:rFonts w:ascii="Arial" w:hAnsi="Arial"/>
-        </w:rPr>
-        <w:t>ב־20.8: רכב אחד עם הסבא והסבתא ממשיך לליבק ומוחזר שם ב־21.8; הרכב השני חוזר עם יתר המשפחה לברלין ומוחזר בברלין ב־20.8.</w:t>
+        <w:t>ב־20.8: הסבא והסבתא נוסעים ברכב מאברסוולדה לליבק דרך שוורין, עם עצירת צהריים וטיול קצר בעיר. הרכב מוחזר בליבק בבוקר 21.8. יתר המשפחה חוזרים ברכב השני לברלין ומחזירים אותו ב־20.8.</w:t>
       </w:r>
     </w:p>
     <w:p>
@@ -1222,9 +1219,105 @@
       </w:pPr>
       <w:r>
         <w:rPr>
-          <w:rFonts w:ascii="Arial" w:hAnsi="Arial"/>
+          <w:b/>
         </w:rPr>
-        <w:t>סבא וסבתא: נסיעה לליבק, צ׳ק־אין במלון וערב בעיר העתיקה.</w:t>
+        <w:t xml:space="preserve">סבא וסבתא — נסיעה לליבק דרך שוורין: </w:t>
+      </w:r>
+      <w:r>
+        <w:t>יציאה מאברסוולדה בסביבות 09:00 ונסיעה מערבה דרך A10/A24/A14. עצירת צהריים בשוורין ולאחריה המשך לליבק.</w:t>
+      </w:r>
+    </w:p>
+    <w:p>
+      <w:pPr>
+        <w:pStyle w:val="ListBullet"/>
+        <w:bidi/>
+        <w:jc w:val="right"/>
+      </w:pPr>
+      <w:r>
+        <w:rPr>
+          <w:b/>
+        </w:rPr>
+        <w:t xml:space="preserve">מסלול נהיגה מוצע: </w:t>
+      </w:r>
+      <w:hyperlink r:id="rId67">
+        <w:r>
+          <w:rPr>
+            <w:color w:val="0563C1"/>
+            <w:u w:val="single"/>
+          </w:rPr>
+          <w:t>Eberswalde → Schwerin → Lübeck ב־Google Maps</w:t>
+        </w:r>
+      </w:hyperlink>
+      <w:r>
+        <w:t>. יש לבדוק עומסי תנועה בזמן אמת לפני היציאה.</w:t>
+      </w:r>
+    </w:p>
+    <w:p>
+      <w:pPr>
+        <w:pStyle w:val="ListBullet"/>
+        <w:bidi/>
+        <w:jc w:val="right"/>
+      </w:pPr>
+      <w:r>
+        <w:rPr>
+          <w:b/>
+        </w:rPr>
+        <w:t xml:space="preserve">עצירת צהריים בשוורין (כשעתיים): </w:t>
+      </w:r>
+      <w:r>
+        <w:t xml:space="preserve">חניה באזור העיר העתיקה, הליכה קצרה אל </w:t>
+      </w:r>
+      <w:hyperlink r:id="rId68">
+        <w:r>
+          <w:rPr>
+            <w:color w:val="0563C1"/>
+            <w:u w:val="single"/>
+          </w:rPr>
+          <w:t>טירת שוורין</w:t>
+        </w:r>
+      </w:hyperlink>
+      <w:r>
+        <w:t xml:space="preserve"> ואל Markt. לארוחה מומלץ </w:t>
+      </w:r>
+      <w:hyperlink r:id="rId69">
+        <w:r>
+          <w:rPr>
+            <w:color w:val="0563C1"/>
+            <w:u w:val="single"/>
+          </w:rPr>
+          <w:t>Weinhaus Uhle</w:t>
+        </w:r>
+      </w:hyperlink>
+      <w:r>
+        <w:t xml:space="preserve"> באווירה היסטורית; לחלופה קלה יותר: </w:t>
+      </w:r>
+      <w:hyperlink r:id="rId70">
+        <w:r>
+          <w:rPr>
+            <w:color w:val="0563C1"/>
+            <w:u w:val="single"/>
+          </w:rPr>
+          <w:t>Café Prag</w:t>
+        </w:r>
+      </w:hyperlink>
+      <w:r>
+        <w:t>. מומלץ להזמין שולחן מראש.</w:t>
+      </w:r>
+    </w:p>
+    <w:p>
+      <w:pPr>
+        <w:pStyle w:val="ListBullet"/>
+        <w:bidi/>
+        <w:jc w:val="right"/>
+      </w:pPr>
+      <w:r>
+        <w:rPr>
+          <w:b/>
+        </w:rPr>
+        <w:t xml:space="preserve">לוח זמנים משוער: </w:t>
+      </w:r>
+      <w:r>
+        <w:t>יציאה 09:00; הגעה לשוורין סביב הצהריים; ארוחה והליכה קצרה 12:00–14:15; יציאה לליבק והגעה משוערת 15:30–16:00, בהתאם לתנועה.</w:t>
       </w:r>
     </w:p>
     <w:p>
@@ -1398,34 +1491,57 @@
       </w:pPr>
       <w:r>
         <w:rPr>
-          <w:rFonts w:ascii="Arial" w:hAnsi="Arial"/>
+          <w:b/>
         </w:rPr>
-        <w:t>החזרת הרכב בליבק והמשך להמבורג. טיול ב־</w:t>
+        <w:t xml:space="preserve">בוקר 21.8 — מעבר מליבק להמבורג ברכבת: </w:t>
       </w:r>
-      <w:hyperlink r:id="rId55">
+      <w:r>
+        <w:t>החזרת הרכב בליבק, מעבר אל Lübeck Hbf ונסיעה ברכבת אזורית ישירה RE8 או RE80 אל Hamburg Hbf.</w:t>
+      </w:r>
+    </w:p>
+    <w:p>
+      <w:pPr>
+        <w:pStyle w:val="ListBullet"/>
+        <w:bidi/>
+        <w:jc w:val="right"/>
+      </w:pPr>
+      <w:r>
+        <w:t>הרכבות הישירות פועלות בדרך כלל בתדירות גבוהה ביום חול, וזמן הנסיעה הוא בערך 45–50 דקות. יש לבדוק את השעה המדויקת ואת עבודות המסילה סמוך לנסיעה ב־</w:t>
+      </w:r>
+      <w:hyperlink r:id="rId71">
         <w:r>
           <w:rPr>
             <w:color w:val="0563C1"/>
             <w:u w:val="single"/>
           </w:rPr>
-          <w:t>Speicherstadt</w:t>
+          <w:t>Deutsche Bahn</w:t>
         </w:r>
       </w:hyperlink>
       <w:r>
-        <w:rPr>
-          <w:rFonts w:ascii="Arial" w:hAnsi="Arial"/>
-        </w:rPr>
-        <w:t xml:space="preserve"> וב־</w:t>
+        <w:t>.</w:t>
       </w:r>
-      <w:hyperlink r:id="rId56">
+    </w:p>
+    <w:p>
+      <w:pPr>
+        <w:pStyle w:val="ListBullet"/>
+        <w:bidi/>
+        <w:jc w:val="right"/>
+      </w:pPr>
+      <w:r>
+        <w:t xml:space="preserve">אין צורך ברכב בהמבורג: מלון Reichshof נמצא מול Hamburg Hbf. </w:t>
+      </w:r>
+      <w:hyperlink r:id="rId72">
         <w:r>
           <w:rPr>
             <w:color w:val="0563C1"/>
             <w:u w:val="single"/>
           </w:rPr>
-          <w:t>HafenCity</w:t>
+          <w:t>מסלול הליכה מהתחנה למלון</w:t>
         </w:r>
       </w:hyperlink>
+      <w:r>
+        <w:t>.</w:t>
+      </w:r>
     </w:p>
     <w:p>
       <w:pPr>

</xml_diff>